<commit_message>
revert: 按 c6c920b 完全恢复上一版 UI
</commit_message>
<xml_diff>
--- a/docs/习得-项目详细介绍.docx
+++ b/docs/习得-项目详细介绍.docx
@@ -1179,7 +1179,7 @@
                 <w:color w:val="18191C"/>
                 <w:sz w:val="18"/>
               </w:rPr>
-              <w:t>座位图交互、多建筑/多楼层、预约卡、A* 导航、AI 推荐理由</w:t>
+              <w:t>座位图交互、预约卡、A* 导航、AI 推荐理由</w:t>
             </w:r>
           </w:p>
         </w:tc>
@@ -1410,7 +1410,7 @@
                 <w:color w:val="18191C"/>
                 <w:sz w:val="18"/>
               </w:rPr>
-              <w:t>登录/退出、找座、预约、导航、签到、学习计时、卡住了辅导、接棒、反馈、交棒、查看学习档案</w:t>
+              <w:t>登录、找座、预约、导航、签到、学习计时、卡住了辅导、接棒、反馈、交棒、查看学习档案</w:t>
             </w:r>
           </w:p>
         </w:tc>
@@ -1558,7 +1558,7 @@
           <w:color w:val="18191C"/>
           <w:sz w:val="21"/>
         </w:rPr>
-        <w:t>演示账号（密码均 123456）：student / reviewer / admin / teacher。右上角有「退出」按钮，调用 /api/auth/logout 后回到登录页。</w:t>
+        <w:t>演示账号（密码均 123456）：student / reviewer / admin / teacher。</w:t>
       </w:r>
     </w:p>
     <w:p/>
@@ -1670,7 +1670,7 @@
           <w:color w:val="61666D"/>
           <w:sz w:val="17"/>
         </w:rPr>
-        <w:t>首页建议 → 选建筑/楼层 → 找座 → 预约 → A* 导航 → 签到</w:t>
+        <w:t>首页建议 → 找座 → 预约 → A* 导航 → 签到</w:t>
       </w:r>
     </w:p>
     <w:p>
@@ -1815,7 +1815,7 @@
           <w:color w:val="18191C"/>
           <w:sz w:val="24"/>
         </w:rPr>
-        <w:t>6.1 多建筑 / 多楼层（泛化）</w:t>
+        <w:t>6.1 单层演示 + 可扩展空间模型</w:t>
       </w:r>
     </w:p>
     <w:p>
@@ -1830,7 +1830,7 @@
           <w:color w:val="18191C"/>
           <w:sz w:val="20"/>
         </w:rPr>
-        <w:t>数据模型：floors(building, floor_no, name, plan_w, plan_h) + seats(floor_id, ...) + nav_nodes/nav_edges(floor_id, ...)；</w:t>
+        <w:t>当前演示：图书馆 2F 静学自习区，48 座；</w:t>
       </w:r>
     </w:p>
     <w:p>
@@ -1845,7 +1845,7 @@
           <w:color w:val="18191C"/>
           <w:sz w:val="20"/>
         </w:rPr>
-        <w:t>演示数据：图书馆 2F 静学自习区（48 座）、图书馆 3F 研讨协作区（16 座）、教学楼 A 1F 自习室（15 座），共 79 座；</w:t>
+        <w:t>数据模型：floors(building, floor_no, name) + seats(floor_id) + nav_nodes/nav_edges(floor_id)，按楼层组织，天然支持扩展；</w:t>
       </w:r>
     </w:p>
     <w:p>
@@ -1860,22 +1860,7 @@
           <w:color w:val="18191C"/>
           <w:sz w:val="20"/>
         </w:rPr>
-        <w:t>前端：建筑下拉 + 楼层 Tab + 当前楼层标签；切换后自动加载该层座位与路网；</w:t>
-      </w:r>
-    </w:p>
-    <w:p>
-      <w:pPr>
-        <w:pStyle w:val="ListBullet"/>
-        <w:spacing w:after="40"/>
-      </w:pPr>
-      <w:r>
-        <w:rPr>
-          <w:rFonts w:ascii="微软雅黑" w:hAnsi="微软雅黑" w:eastAsia="微软雅黑"/>
-          <w:b w:val="0"/>
-          <w:color w:val="18191C"/>
-          <w:sz w:val="20"/>
-        </w:rPr>
-        <w:t>泛化方式：新增场馆只改 seed.py 的 FLOOR_SPECS，路由/座位/导航/统计自动适配；</w:t>
+        <w:t>本轮 UI 聚焦单层演示，多楼层切换为后续扩展项；</w:t>
       </w:r>
     </w:p>
     <w:p>
@@ -2038,22 +2023,7 @@
           <w:color w:val="18191C"/>
           <w:sz w:val="20"/>
         </w:rPr>
-        <w:t>导航页显示建筑/楼层/座位，支持从入口到任意座位；</w:t>
-      </w:r>
-    </w:p>
-    <w:p>
-      <w:pPr>
-        <w:pStyle w:val="ListBullet"/>
-        <w:spacing w:after="40"/>
-      </w:pPr>
-      <w:r>
-        <w:rPr>
-          <w:rFonts w:ascii="微软雅黑" w:hAnsi="微软雅黑" w:eastAsia="微软雅黑"/>
-          <w:b w:val="0"/>
-          <w:color w:val="18191C"/>
-          <w:sz w:val="20"/>
-        </w:rPr>
-        <w:t>换楼层回到空间页重新选择。</w:t>
+        <w:t>导航页显示座位/区域，支持从入口到任意座位。</w:t>
       </w:r>
     </w:p>
     <w:p>
@@ -4248,7 +4218,7 @@
           <w:color w:val="18191C"/>
           <w:sz w:val="20"/>
         </w:rPr>
-        <w:t>建筑/楼层/座位/路网均为数据驱动；</w:t>
+        <w:t>座位/路网按 floor_id 组织，数据模型天然支持扩展；</w:t>
       </w:r>
     </w:p>
     <w:p>
@@ -4263,7 +4233,7 @@
           <w:color w:val="18191C"/>
           <w:sz w:val="20"/>
         </w:rPr>
-        <w:t>新增建筑只改 FLOOR_SPECS，不用改 API/页面；</w:t>
+        <w:t>当前演示聚焦 2F 单层，新增楼层时扩展 seed 数据即可；</w:t>
       </w:r>
     </w:p>
     <w:p>
@@ -4278,22 +4248,7 @@
           <w:color w:val="18191C"/>
           <w:sz w:val="20"/>
         </w:rPr>
-        <w:t>工作流引擎与内容匹配不依赖具体楼层；</w:t>
-      </w:r>
-    </w:p>
-    <w:p>
-      <w:pPr>
-        <w:pStyle w:val="ListBullet"/>
-        <w:spacing w:after="40"/>
-      </w:pPr>
-      <w:r>
-        <w:rPr>
-          <w:rFonts w:ascii="微软雅黑" w:hAnsi="微软雅黑" w:eastAsia="微软雅黑"/>
-          <w:b w:val="0"/>
-          <w:color w:val="18191C"/>
-          <w:sz w:val="20"/>
-        </w:rPr>
-        <w:t>智能体查询自动 join floors，不写死楼层。</w:t>
+        <w:t>工作流引擎与内容匹配不依赖具体楼层。</w:t>
       </w:r>
     </w:p>
     <w:p>
@@ -4579,7 +4534,7 @@
                 <w:color w:val="18191C"/>
                 <w:sz w:val="18"/>
               </w:rPr>
-              <w:t>座位/楼层</w:t>
+              <w:t>座位</w:t>
             </w:r>
           </w:p>
         </w:tc>
@@ -4599,7 +4554,7 @@
                 <w:color w:val="18191C"/>
                 <w:sz w:val="18"/>
               </w:rPr>
-              <w:t>支持多建筑多楼层</w:t>
+              <w:t>单层演示</w:t>
             </w:r>
           </w:p>
         </w:tc>
@@ -4619,7 +4574,7 @@
                 <w:color w:val="18191C"/>
                 <w:sz w:val="18"/>
               </w:rPr>
-              <w:t>3 层 / 79 座</w:t>
+              <w:t>48 座</w:t>
             </w:r>
           </w:p>
         </w:tc>
@@ -5360,7 +5315,7 @@
                 <w:color w:val="18191C"/>
                 <w:sz w:val="18"/>
               </w:rPr>
-              <w:t>选建筑/楼层 → 推荐 A-06 → 预约</w:t>
+              <w:t>推荐 A-06 → 预约</w:t>
             </w:r>
           </w:p>
         </w:tc>
@@ -5875,7 +5830,7 @@
           <w:color w:val="18191C"/>
           <w:sz w:val="20"/>
         </w:rPr>
-        <w:t>79 座 / 3 层 / 多建筑选择；</w:t>
+        <w:t>48 座 / 单层演示；</w:t>
       </w:r>
     </w:p>
     <w:p>
@@ -5951,21 +5906,6 @@
           <w:sz w:val="20"/>
         </w:rPr>
         <w:t>个人学习档案 + 学习名片；</w:t>
-      </w:r>
-    </w:p>
-    <w:p>
-      <w:pPr>
-        <w:pStyle w:val="ListBullet"/>
-        <w:spacing w:after="40"/>
-      </w:pPr>
-      <w:r>
-        <w:rPr>
-          <w:rFonts w:ascii="微软雅黑" w:hAnsi="微软雅黑" w:eastAsia="微软雅黑"/>
-          <w:b w:val="0"/>
-          <w:color w:val="18191C"/>
-          <w:sz w:val="20"/>
-        </w:rPr>
-        <w:t>退出登录；</w:t>
       </w:r>
     </w:p>
     <w:p>
@@ -6488,7 +6428,7 @@
           <w:color w:val="18191C"/>
           <w:sz w:val="21"/>
         </w:rPr>
-        <w:t>登录/退出、座位、楼层、预约、签到、结束、导航、辅导、助手、内容、审核、接棒、消息、工作流、设备上报。</w:t>
+        <w:t>登录、座位、预约、签到、结束、导航、辅导、助手、内容、审核、接棒、消息、工作流、设备上报。</w:t>
       </w:r>
     </w:p>
     <w:sectPr>

</xml_diff>